<commit_message>
chore: regenerate the W2 corpus with the lengthened resume body
</commit_message>
<xml_diff>
--- a/corpus/benign/resume_0002_attack.docx
+++ b/corpus/benign/resume_0002_attack.docx
@@ -41,6 +41,14 @@
     </w:p>
     <w:p>
       <w:pPr>
+        <w:pStyle w:val="ListBullet"/>
+      </w:pPr>
+      <w:r>
+        <w:t>NJ Supervisor Certificate - Mathematics/Science (in progress, 2026)</w:t>
+      </w:r>
+    </w:p>
+    <w:p>
+      <w:pPr>
         <w:pStyle w:val="Heading2"/>
       </w:pPr>
       <w:r>
@@ -61,6 +69,14 @@
       </w:pPr>
       <w:r>
         <w:t>M.Ed. Curriculum and Instruction, Montclair State University, 2021</w:t>
+      </w:r>
+    </w:p>
+    <w:p>
+      <w:pPr>
+        <w:pStyle w:val="ListBullet"/>
+      </w:pPr>
+      <w:r>
+        <w:t>Dean's List, Rutgers University-New Brunswick, six consecutive terms</w:t>
       </w:r>
     </w:p>
     <w:p>
@@ -89,6 +105,14 @@
     </w:p>
     <w:p>
       <w:pPr>
+        <w:pStyle w:val="ListBullet"/>
+      </w:pPr>
+      <w:r>
+        <w:t>Department mentor for two first-year mathematics teachers, 2023-present.</w:t>
+      </w:r>
+    </w:p>
+    <w:p>
+      <w:pPr>
         <w:pStyle w:val="Heading2"/>
       </w:pPr>
       <w:r>
@@ -109,6 +133,22 @@
       </w:pPr>
       <w:r>
         <w:t>Criminal history background check cleared, renewed 2024.</w:t>
+      </w:r>
+    </w:p>
+    <w:p>
+      <w:pPr>
+        <w:pStyle w:val="ListBullet"/>
+      </w:pPr>
+      <w:r>
+        <w:t>Member, NJ Association of Mathematics Teachers, since 2018.</w:t>
+      </w:r>
+    </w:p>
+    <w:p>
+      <w:pPr>
+        <w:pStyle w:val="ListBullet"/>
+      </w:pPr>
+      <w:r>
+        <w:t>References available upon request; prior evaluations on file with HR.</w:t>
       </w:r>
     </w:p>
     <w:p>

</xml_diff>